<commit_message>
Add Module 3.3 folder, HTML, CSS, and index link
</commit_message>
<xml_diff>
--- a/module-3/Thies_assign3_2.docx
+++ b/module-3/Thies_assign3_2.docx
@@ -20,11 +20,17 @@
         <w:rPr>
           <w:noProof/>
         </w:rPr>
+        <w:t xml:space="preserve"> </w:t>
+      </w:r>
+      <w:r>
+        <w:rPr>
+          <w:noProof/>
+        </w:rPr>
         <w:drawing>
-          <wp:inline distT="0" distB="0" distL="0" distR="0" wp14:anchorId="7FE059A8" wp14:editId="1AC04869">
-            <wp:extent cx="5943600" cy="4768215"/>
-            <wp:effectExtent l="0" t="0" r="0" b="0"/>
-            <wp:docPr id="133205187" name="Picture 1"/>
+          <wp:inline distT="0" distB="0" distL="0" distR="0" wp14:anchorId="49D1638C" wp14:editId="3402EB6D">
+            <wp:extent cx="5943600" cy="5579110"/>
+            <wp:effectExtent l="0" t="0" r="0" b="2540"/>
+            <wp:docPr id="1228269067" name="Picture 1"/>
             <wp:cNvGraphicFramePr>
               <a:graphicFrameLocks xmlns:a="http://schemas.openxmlformats.org/drawingml/2006/main" noChangeAspect="1"/>
             </wp:cNvGraphicFramePr>
@@ -32,17 +38,11 @@
               <a:graphicData uri="http://schemas.openxmlformats.org/drawingml/2006/picture">
                 <pic:pic xmlns:pic="http://schemas.openxmlformats.org/drawingml/2006/picture">
                   <pic:nvPicPr>
-                    <pic:cNvPr id="133205187" name="Picture 133205187"/>
+                    <pic:cNvPr id="1228269067" name=""/>
                     <pic:cNvPicPr/>
                   </pic:nvPicPr>
                   <pic:blipFill>
-                    <a:blip r:embed="rId4">
-                      <a:extLst>
-                        <a:ext uri="{28A0092B-C50C-407E-A947-70E740481C1C}">
-                          <a14:useLocalDpi xmlns:a14="http://schemas.microsoft.com/office/drawing/2010/main" val="0"/>
-                        </a:ext>
-                      </a:extLst>
-                    </a:blip>
+                    <a:blip r:embed="rId4"/>
                     <a:stretch>
                       <a:fillRect/>
                     </a:stretch>
@@ -50,7 +50,7 @@
                   <pic:spPr>
                     <a:xfrm>
                       <a:off x="0" y="0"/>
-                      <a:ext cx="5943600" cy="4768215"/>
+                      <a:ext cx="5943600" cy="5579110"/>
                     </a:xfrm>
                     <a:prstGeom prst="rect">
                       <a:avLst/>
@@ -68,7 +68,7 @@
         </w:rPr>
         <w:lastRenderedPageBreak/>
         <w:drawing>
-          <wp:inline distT="0" distB="0" distL="0" distR="0" wp14:anchorId="079E4155" wp14:editId="36DBD281">
+          <wp:inline distT="0" distB="0" distL="0" distR="0" wp14:anchorId="079E4155" wp14:editId="2820F814">
             <wp:extent cx="5943600" cy="2827655"/>
             <wp:effectExtent l="0" t="0" r="0" b="0"/>
             <wp:docPr id="2061659895" name="Picture 2"/>

</xml_diff>